<commit_message>
Refresh live and historical market data
</commit_message>
<xml_diff>
--- a/src/historical_asymmetric_theory.docx
+++ b/src/historical_asymmetric_theory.docx
@@ -147,7 +147,7 @@
           </w:tcPr>
           <w:p>
             <w:r>
-              <w:t>6</w:t>
+              <w:t>4</w:t>
             </w:r>
           </w:p>
         </w:tc>
@@ -157,7 +157,7 @@
           </w:tcPr>
           <w:p>
             <w:r>
-              <w:t>130.10%</w:t>
+              <w:t>71.60%</w:t>
             </w:r>
           </w:p>
         </w:tc>
@@ -167,7 +167,7 @@
           </w:tcPr>
           <w:p>
             <w:r>
-              <w:t>27.07%</w:t>
+              <w:t>14.43%</w:t>
             </w:r>
           </w:p>
         </w:tc>
@@ -177,7 +177,7 @@
           </w:tcPr>
           <w:p>
             <w:r>
-              <w:t>38.60%</w:t>
+              <w:t>43.84%</w:t>
             </w:r>
           </w:p>
         </w:tc>
@@ -187,7 +187,7 @@
           </w:tcPr>
           <w:p>
             <w:r>
-              <w:t>32.84%</w:t>
+              <w:t>29.14%</w:t>
             </w:r>
           </w:p>
         </w:tc>
@@ -197,7 +197,7 @@
           </w:tcPr>
           <w:p>
             <w:r>
-              <w:t>+97.26</w:t>
+              <w:t>+42.46</w:t>
             </w:r>
           </w:p>
         </w:tc>
@@ -239,7 +239,7 @@
           </w:tcPr>
           <w:p>
             <w:r>
-              <w:t>226.15%</w:t>
+              <w:t>203.31%</w:t>
             </w:r>
           </w:p>
         </w:tc>
@@ -249,7 +249,7 @@
           </w:tcPr>
           <w:p>
             <w:r>
-              <w:t>77.99%</w:t>
+              <w:t>65.52%</w:t>
             </w:r>
           </w:p>
         </w:tc>
@@ -259,7 +259,7 @@
           </w:tcPr>
           <w:p>
             <w:r>
-              <w:t>77.20%</w:t>
+              <w:t>82.62%</w:t>
             </w:r>
           </w:p>
         </w:tc>
@@ -269,7 +269,7 @@
           </w:tcPr>
           <w:p>
             <w:r>
-              <w:t>77.59%</w:t>
+              <w:t>74.07%</w:t>
             </w:r>
           </w:p>
         </w:tc>
@@ -279,7 +279,7 @@
           </w:tcPr>
           <w:p>
             <w:r>
-              <w:t>+148.55</w:t>
+              <w:t>+129.24</w:t>
             </w:r>
           </w:p>
         </w:tc>

</xml_diff>